<commit_message>
Publish report v3.7 and link the archived original evidence
</commit_message>
<xml_diff>
--- a/evaluation/recommendation-fit-2026-10-21/01_Latest_Testing_and_Acceptance_Report.docx
+++ b/evaluation/recommendation-fit-2026-10-21/01_Latest_Testing_and_Acceptance_Report.docx
@@ -12,17 +12,17 @@
     </w:p>
     <w:p>
       <w:r>
-        <w:t>Group 42   Multi Agent Assistance System   Version 3.6</w:t>
+        <w:t>Group 42   Multi Agent Assistance System   Version 3.7</w:t>
       </w:r>
     </w:p>
     <w:p>
       <w:r>
-        <w:t>The local recommendation fixes passed all 44 frozen cases: 24 structured matches, 8 evidence projections and 12 deployed dialogue turns. All eight previously failed turns now pass. Independent checks found zero hard-requirement violations in 36 displayed verified occurrences. DEF09 to DEF12 are verified on the local patch; five earlier issue groups remain open. GitHub integration and final system acceptance remain PENDING.</w:t>
+        <w:t>The local recommendation fixes passed all 44 frozen cases: 24 structured matches, 8 evidence projections and 12 deployed dialogue turns. All eight previously failed turns now pass. Independent checks found zero hard-requirement violations in 36 displayed verified occurrences. DEF09 to DEF12 are verified on the local patch; five earlier issue groups remain open. The fixes and evidence are published in GitHub PR 2. Merge and final system acceptance remain PENDING.</w:t>
       </w:r>
     </w:p>
     <w:p>
       <w:r>
-        <w:t>Base source 89131897f56bbc176c30246a451f118f7de0209f was pinned and 410 available blobs matched Git object hashes. The 21 October 2026 local remediation changes six existing files and adds four files. Patch SHA256 d26533c3f606fb5bc6c71be66db901e142591c2507b950cfff83bc023aee285e. This patch has not been pushed to GitHub.</w:t>
+        <w:t>Base source 89131897f56bbc176c30246a451f118f7de0209f was pinned and 410 available blobs matched Git object hashes. The 21 October 2026 local remediation changes six existing files and adds four files. Patch SHA256 d26533c3f606fb5bc6c71be66db901e142591c2507b950cfff83bc023aee285e. Published in GitHub PR 2 on 21 October 2026; review and merge remain pending.</w:t>
       </w:r>
     </w:p>
     <w:p>
@@ -35,7 +35,7 @@
     </w:p>
     <w:p>
       <w:r>
-        <w:t>Earlier scripted, retrieval and real-model results retain their recorded scopes. This revision adds a local code fix and repeats the identical 44-case recommendation-fit catalogue against the same SQL and Neo4j snapshot, retained retrieval indexes and actual ClinePass model. Existing test assertions were preserved and 26 supporting regression checks were added. Participant UAT remains NOT_RUN.</w:t>
+        <w:t>Earlier scripted, retrieval and real-model results retain their recorded scopes. The recorded v3.6 remediation added a local code fix and repeated the identical 44-case recommendation-fit catalogue against the same SQL and Neo4j snapshot, retained retrieval indexes and actual ClinePass model. Existing test assertions were preserved and 26 supporting regression checks were added. The 22 October v3.7 publication update adds no test run. Participant UAT remains NOT_RUN.</w:t>
       </w:r>
     </w:p>
     <w:tbl>
@@ -13738,6 +13738,8 @@
     <w:p>
       <w:r>
         <w:t>Repository source https://github.com/zhexusun10/Multi-Agent-Assistance-System/tree/89131897f56bbc176c30246a451f118f7de0209f</w:t>
+        <w:br/>
+        <w:t>Published PR https://github.com/zhexusun10/Multi-Agent-Assistance-System/pull/2</w:t>
       </w:r>
     </w:p>
     <w:p>

</xml_diff>